<commit_message>
Stage 2 docx: close all slots per instruction; one section reserved for the union
1.4 none of the seven questions answered; 1.5 single further response, resolves
nothing; 1.6 special-leave request unanswered; 2.4 slot removed. New section 3
reserved for Together Queensland; Arrangements renumbered 4. Metadata
re-scrubbed and verified.

Co-Authored-By: Claude Fable 5 <noreply@anthropic.com>
Claude-Session: https://claude.ai/code/session_01P17mt65P6No5vkc3DV9xfU
</commit_message>
<xml_diff>
--- a/wc2024227/drafts/out/STAGE2_REFERRAL_DRAFT_FOR_REVIEW.docx
+++ b/wc2024227/drafts/out/STAGE2_REFERRAL_DRAFT_FOR_REVIEW.docx
@@ -29,7 +29,7 @@
           <w:sz w:val="18"/>
           <w:szCs w:val="18"/>
         </w:rPr>
-        <w:t xml:space="preserve">Stage 2 referral · finalise the three highlighted passages from the Health Service's latest Stage 1 response, then send Monday 10 August 2026.</w:t>
+        <w:t xml:space="preserve">Stage 2 referral · one section remains open, reserved for Together Queensland's input; all else is final. Send Monday 10 August 2026.</w:t>
       </w:r>
     </w:p>
     <w:p>
@@ -104,27 +104,7 @@
           <w:sz w:val="21"/>
           <w:szCs w:val="21"/>
         </w:rPr>
-        <w:t xml:space="preserve">(1) Notice of dispute, 3 August 2026; (2) Ms Taylor's letter, 4 August 2026; (3) my response dated 4 August 2026 (provided 5 August 2026); (4) the Health Service's Stage 1 response of </w:t>
-      </w:r>
-      <w:r>
-        <w:rPr>
-          <w:rFonts w:ascii="Calibri" w:cs="Calibri" w:eastAsia="Calibri" w:hAnsi="Calibri"/>
-          <w:color w:val="7A5C00"/>
-          <w:sz w:val="21"/>
-          <w:szCs w:val="21"/>
-          <w:highlight w:val="yellow"/>
-          <w:highlightCs w:val="yellow"/>
-        </w:rPr>
-        <w:t xml:space="preserve">[DATE]</w:t>
-      </w:r>
-      <w:r>
-        <w:rPr>
-          <w:rFonts w:ascii="Calibri" w:cs="Calibri" w:eastAsia="Calibri" w:hAnsi="Calibri"/>
-          <w:color w:val="111111"/>
-          <w:sz w:val="21"/>
-          <w:szCs w:val="21"/>
-        </w:rPr>
-        <w:t xml:space="preserve">.</w:t>
+        <w:t xml:space="preserve">(1) Notice of dispute, 3 August 2026; (2) Ms Taylor's letter, 4 August 2026; (3) my response dated 4 August 2026 (provided 5 August 2026); (4) the Health Service's further Stage 1 response.</w:t>
       </w:r>
     </w:p>
     <w:p>
@@ -261,8 +241,164 @@
           <w:sz w:val="21"/>
           <w:szCs w:val="21"/>
         </w:rPr>
-        <w:t xml:space="preserve">1.4	My response set out, at its section 2, five facts and invited correction; none has been corrected. It asked, at its section 3, seven questions so that the correct arrangement could be applied, and asked that any answer sitting with a more senior decision-maker be escalated within Stage 1 so the seven days were not lost. </w:t>
-      </w:r>
+        <w:t xml:space="preserve">1.4	My response set out, at its section 2, five facts and invited correction; none has been corrected. It asked, at its section 3, seven questions so that the correct arrangement could be applied, and asked that any answer sitting with a more senior decision-maker be escalated within Stage 1 so the seven days were not lost. None of the seven questions has been answered.</w:t>
+      </w:r>
+    </w:p>
+    <w:p>
+      <w:pPr>
+        <w:spacing w:after="160" w:line="276"/>
+        <w:ind w:left="360" w:hanging="360"/>
+      </w:pPr>
+      <w:r>
+        <w:rPr>
+          <w:rFonts w:ascii="Calibri" w:cs="Calibri" w:eastAsia="Calibri" w:hAnsi="Calibri"/>
+          <w:color w:val="111111"/>
+          <w:sz w:val="21"/>
+          <w:szCs w:val="21"/>
+        </w:rPr>
+        <w:t xml:space="preserve">1.5	The Health Service has since provided one further written response, which is the only response received to my correspondence of 5 August 2026. It does not resolve the matters in dispute: it does not identify the instrument under which I am held from work (question 3.1), it does not restore the status quo under clause 1.11.4, and the leave and pay position from 26 June 2026 remains as it was.</w:t>
+      </w:r>
+    </w:p>
+    <w:p>
+      <w:pPr>
+        <w:spacing w:after="160" w:line="276"/>
+        <w:ind w:left="360" w:hanging="360"/>
+      </w:pPr>
+      <w:r>
+        <w:rPr>
+          <w:rFonts w:ascii="Calibri" w:cs="Calibri" w:eastAsia="Calibri" w:hAnsi="Calibri"/>
+          <w:color w:val="111111"/>
+          <w:sz w:val="21"/>
+          <w:szCs w:val="21"/>
+        </w:rPr>
+        <w:t xml:space="preserve">1.6	My response of 5 August 2026 stated that I did not consent to my recreation leave being applied to the period 20 July to 2 August 2026, and requested special leave on full pay under Directive 12/24 instead. That request has not been answered. Any leave applied is, per that response, recorded as applied at the Health Service's initiative, without my consent, without prejudice to the dispute, and subject to re-credit.</w:t>
+      </w:r>
+    </w:p>
+    <w:p>
+      <w:pPr>
+        <w:spacing w:after="160" w:line="276"/>
+      </w:pPr>
+      <w:r>
+        <w:rPr>
+          <w:rFonts w:ascii="Calibri" w:cs="Calibri" w:eastAsia="Calibri" w:hAnsi="Calibri"/>
+          <w:color w:val="111111"/>
+          <w:sz w:val="21"/>
+          <w:szCs w:val="21"/>
+        </w:rPr>
+        <w:t xml:space="preserve">My response foreshadowed this referral in terms: “If the dispute is unresolved by 10 August I will refer it to Stage 2 as the clause provides.” It is unresolved, and this is that referral.</w:t>
+      </w:r>
+    </w:p>
+    <w:p>
+      <w:pPr>
+        <w:spacing w:after="160" w:line="276"/>
+      </w:pPr>
+      <w:r>
+        <w:rPr>
+          <w:rFonts w:ascii="Calibri" w:cs="Calibri" w:eastAsia="Calibri" w:hAnsi="Calibri"/>
+          <w:b/>
+          <w:bCs/>
+          <w:color w:val="111111"/>
+          <w:sz w:val="21"/>
+          <w:szCs w:val="21"/>
+        </w:rPr>
+        <w:t xml:space="preserve">2  What the conference needs to resolve</w:t>
+      </w:r>
+    </w:p>
+    <w:p>
+      <w:pPr>
+        <w:spacing w:after="160" w:line="276"/>
+        <w:ind w:left="360" w:hanging="360"/>
+      </w:pPr>
+      <w:r>
+        <w:rPr>
+          <w:rFonts w:ascii="Calibri" w:cs="Calibri" w:eastAsia="Calibri" w:hAnsi="Calibri"/>
+          <w:color w:val="111111"/>
+          <w:sz w:val="21"/>
+          <w:szCs w:val="21"/>
+        </w:rPr>
+        <w:t xml:space="preserve">2.1	The instrument question: what decision prevents my attendance since 26 June 2026, made by whom, on what date, under what power. Asked in the notice of 3 August (sections 2.1 and 4(b)–(c)), in my response (questions 3.1 to 3.3), and in earlier correspondence; unanswered.</w:t>
+      </w:r>
+    </w:p>
+    <w:p>
+      <w:pPr>
+        <w:spacing w:after="160" w:line="276"/>
+        <w:ind w:left="360" w:hanging="360"/>
+      </w:pPr>
+      <w:r>
+        <w:rPr>
+          <w:rFonts w:ascii="Calibri" w:cs="Calibri" w:eastAsia="Calibri" w:hAnsi="Calibri"/>
+          <w:color w:val="111111"/>
+          <w:sz w:val="21"/>
+          <w:szCs w:val="21"/>
+        </w:rPr>
+        <w:t xml:space="preserve">2.2	Pay and leave: wages for the period from 26 June 2026; re-credit of all leave debited; the coding of the absence (special leave on full pay under Directive 12/24 was requested on 5 August); the “income protection” characterisation applied from 13 July 2026, under which I receive neither wages nor benefit (my response, section 5); and cessation of further debits per clause 1.11.4 — the status quo before this dispute emerged was that I was rostered, working and paid.</w:t>
+      </w:r>
+    </w:p>
+    <w:p>
+      <w:pPr>
+        <w:spacing w:after="160" w:line="276"/>
+        <w:ind w:left="360" w:hanging="360"/>
+      </w:pPr>
+      <w:r>
+        <w:rPr>
+          <w:rFonts w:ascii="Calibri" w:cs="Calibri" w:eastAsia="Calibri" w:hAnsi="Calibri"/>
+          <w:color w:val="111111"/>
+          <w:sz w:val="21"/>
+          <w:szCs w:val="21"/>
+        </w:rPr>
+        <w:t xml:space="preserve">2.3	Return to work: the Employee Capabilities Checklist of 3 July 2026 certifies me fit for work with restrictions and records the pattern as a “continuation of existing arrangement”; my return to work proposal of 3 August 2026 stands; no Return to Work Plan exists.</w:t>
+      </w:r>
+    </w:p>
+    <w:p>
+      <w:pPr>
+        <w:spacing w:after="160" w:line="276"/>
+        <w:ind w:left="360" w:hanging="360"/>
+      </w:pPr>
+      <w:r>
+        <w:rPr>
+          <w:rFonts w:ascii="Calibri" w:cs="Calibri" w:eastAsia="Calibri" w:hAnsi="Calibri"/>
+          <w:color w:val="111111"/>
+          <w:sz w:val="21"/>
+          <w:szCs w:val="21"/>
+        </w:rPr>
+        <w:t xml:space="preserve">2.4	The position communicated to my insurer: on 4 August 2026 my income protection insurer recorded, on information from the Health Service, that the Health Service is “currently unable to accommodate a graduated return to work”. I have not been given that position directly, by its maker, with reasons. My response, section 4, sets out what is asked; it remains open.</w:t>
+      </w:r>
+    </w:p>
+    <w:p>
+      <w:pPr>
+        <w:spacing w:after="160" w:line="276"/>
+        <w:ind w:left="360" w:hanging="360"/>
+      </w:pPr>
+      <w:r>
+        <w:rPr>
+          <w:rFonts w:ascii="Calibri" w:cs="Calibri" w:eastAsia="Calibri" w:hAnsi="Calibri"/>
+          <w:color w:val="111111"/>
+          <w:sz w:val="21"/>
+          <w:szCs w:val="21"/>
+        </w:rPr>
+        <w:t xml:space="preserve">2.5	The work health and safety matters: the feedback required by clause 7.1.11 on the matters I have raised, and the psychosocial risk assessment of the work area under clause 7.2, requested on 3 August 2026 and identified by the Health Service's own letter of 7 July 2026, which recorded that it did not then have sufficient information to assess psychosocial hazards affecting my return to work. No assessment has been undertaken.</w:t>
+      </w:r>
+    </w:p>
+    <w:p>
+      <w:pPr>
+        <w:spacing w:after="160" w:line="276"/>
+      </w:pPr>
+      <w:r>
+        <w:rPr>
+          <w:rFonts w:ascii="Calibri" w:cs="Calibri" w:eastAsia="Calibri" w:hAnsi="Calibri"/>
+          <w:b/>
+          <w:bCs/>
+          <w:color w:val="111111"/>
+          <w:sz w:val="21"/>
+          <w:szCs w:val="21"/>
+        </w:rPr>
+        <w:t xml:space="preserve">3  Union representation and delegate status</w:t>
+      </w:r>
+    </w:p>
+    <w:p>
+      <w:pPr>
+        <w:spacing w:after="160" w:line="276"/>
+      </w:pPr>
       <w:r>
         <w:rPr>
           <w:rFonts w:ascii="Calibri" w:cs="Calibri" w:eastAsia="Calibri" w:hAnsi="Calibri"/>
@@ -272,111 +408,7 @@
           <w:highlight w:val="yellow"/>
           <w:highlightCs w:val="yellow"/>
         </w:rPr>
-        <w:t xml:space="preserve">[Adjust from the Stage 1 response: none of the seven questions has been answered / questions X and Y were addressed; the remainder, including question 3.1 (the instrument, the decision-maker and the date), were not.]</w:t>
-      </w:r>
-    </w:p>
-    <w:p>
-      <w:pPr>
-        <w:spacing w:after="160" w:line="276"/>
-        <w:ind w:left="360" w:hanging="360"/>
-      </w:pPr>
-      <w:r>
-        <w:rPr>
-          <w:rFonts w:ascii="Calibri" w:cs="Calibri" w:eastAsia="Calibri" w:hAnsi="Calibri"/>
-          <w:color w:val="111111"/>
-          <w:sz w:val="21"/>
-          <w:szCs w:val="21"/>
-        </w:rPr>
-        <w:t xml:space="preserve">1.5	On </w:t>
-      </w:r>
-      <w:r>
-        <w:rPr>
-          <w:rFonts w:ascii="Calibri" w:cs="Calibri" w:eastAsia="Calibri" w:hAnsi="Calibri"/>
-          <w:color w:val="7A5C00"/>
-          <w:sz w:val="21"/>
-          <w:szCs w:val="21"/>
-          <w:highlight w:val="yellow"/>
-          <w:highlightCs w:val="yellow"/>
-        </w:rPr>
-        <w:t xml:space="preserve">[DATE]</w:t>
-      </w:r>
-      <w:r>
-        <w:rPr>
-          <w:rFonts w:ascii="Calibri" w:cs="Calibri" w:eastAsia="Calibri" w:hAnsi="Calibri"/>
-          <w:color w:val="111111"/>
-          <w:sz w:val="21"/>
-          <w:szCs w:val="21"/>
-        </w:rPr>
-        <w:t xml:space="preserve"> the Health Service provided a written Stage 1 response. It does not resolve the matters in dispute: </w:t>
-      </w:r>
-      <w:r>
-        <w:rPr>
-          <w:rFonts w:ascii="Calibri" w:cs="Calibri" w:eastAsia="Calibri" w:hAnsi="Calibri"/>
-          <w:color w:val="7A5C00"/>
-          <w:sz w:val="21"/>
-          <w:szCs w:val="21"/>
-          <w:highlight w:val="yellow"/>
-          <w:highlightCs w:val="yellow"/>
-        </w:rPr>
-        <w:t xml:space="preserve">[state briefly, e.g. it does not identify the instrument under which I am held from work (question 3.1), it does not restore the status quo under clause 1.11.4, and the leave and pay position from 26 June 2026 remains as it was]</w:t>
-      </w:r>
-      <w:r>
-        <w:rPr>
-          <w:rFonts w:ascii="Calibri" w:cs="Calibri" w:eastAsia="Calibri" w:hAnsi="Calibri"/>
-          <w:color w:val="111111"/>
-          <w:sz w:val="21"/>
-          <w:szCs w:val="21"/>
-        </w:rPr>
-        <w:t xml:space="preserve">.</w:t>
-      </w:r>
-    </w:p>
-    <w:p>
-      <w:pPr>
-        <w:spacing w:after="160" w:line="276"/>
-        <w:ind w:left="360" w:hanging="360"/>
-      </w:pPr>
-      <w:r>
-        <w:rPr>
-          <w:rFonts w:ascii="Calibri" w:cs="Calibri" w:eastAsia="Calibri" w:hAnsi="Calibri"/>
-          <w:color w:val="111111"/>
-          <w:sz w:val="21"/>
-          <w:szCs w:val="21"/>
-        </w:rPr>
-        <w:t xml:space="preserve">1.6	My response of 5 August 2026 stated that I did not consent to my recreation leave being applied to the period 20 July to 2 August 2026, and requested special leave on full pay under Directive 12/24 instead. </w:t>
-      </w:r>
-      <w:r>
-        <w:rPr>
-          <w:rFonts w:ascii="Calibri" w:cs="Calibri" w:eastAsia="Calibri" w:hAnsi="Calibri"/>
-          <w:color w:val="7A5C00"/>
-          <w:sz w:val="21"/>
-          <w:szCs w:val="21"/>
-          <w:highlight w:val="yellow"/>
-          <w:highlightCs w:val="yellow"/>
-        </w:rPr>
-        <w:t xml:space="preserve">[Adjust: The recreation leave was applied at payroll processing notwithstanding / The special leave request has not been answered.]</w:t>
-      </w:r>
-      <w:r>
-        <w:rPr>
-          <w:rFonts w:ascii="Calibri" w:cs="Calibri" w:eastAsia="Calibri" w:hAnsi="Calibri"/>
-          <w:color w:val="111111"/>
-          <w:sz w:val="21"/>
-          <w:szCs w:val="21"/>
-        </w:rPr>
-        <w:t xml:space="preserve"> Any leave applied is, per that response, recorded as applied at the Health Service's initiative, without my consent, without prejudice to the dispute, and subject to re-credit.</w:t>
-      </w:r>
-    </w:p>
-    <w:p>
-      <w:pPr>
-        <w:spacing w:after="160" w:line="276"/>
-      </w:pPr>
-      <w:r>
-        <w:rPr>
-          <w:rFonts w:ascii="Calibri" w:cs="Calibri" w:eastAsia="Calibri" w:hAnsi="Calibri"/>
-          <w:color w:val="111111"/>
-          <w:sz w:val="21"/>
-          <w:szCs w:val="21"/>
-        </w:rPr>
-        <w:t xml:space="preserve">My response foreshadowed this referral in terms: “If the dispute is unresolved by 10 August I will refer it to Stage 2 as the clause provides.” It is unresolved, and this is that referral.</w:t>
+        <w:t xml:space="preserve">[Section reserved for Together Queensland — to be completed on the union's confirmation before sending.]</w:t>
       </w:r>
     </w:p>
     <w:p>
@@ -392,109 +424,7 @@
           <w:sz w:val="21"/>
           <w:szCs w:val="21"/>
         </w:rPr>
-        <w:t xml:space="preserve">2  What the conference needs to resolve</w:t>
-      </w:r>
-    </w:p>
-    <w:p>
-      <w:pPr>
-        <w:spacing w:after="160" w:line="276"/>
-        <w:ind w:left="360" w:hanging="360"/>
-      </w:pPr>
-      <w:r>
-        <w:rPr>
-          <w:rFonts w:ascii="Calibri" w:cs="Calibri" w:eastAsia="Calibri" w:hAnsi="Calibri"/>
-          <w:color w:val="111111"/>
-          <w:sz w:val="21"/>
-          <w:szCs w:val="21"/>
-        </w:rPr>
-        <w:t xml:space="preserve">2.1	The instrument question: what decision prevents my attendance since 26 June 2026, made by whom, on what date, under what power. Asked in the notice of 3 August (sections 2.1 and 4(b)–(c)), in my response (questions 3.1 to 3.3), and in earlier correspondence; unanswered.</w:t>
-      </w:r>
-    </w:p>
-    <w:p>
-      <w:pPr>
-        <w:spacing w:after="160" w:line="276"/>
-        <w:ind w:left="360" w:hanging="360"/>
-      </w:pPr>
-      <w:r>
-        <w:rPr>
-          <w:rFonts w:ascii="Calibri" w:cs="Calibri" w:eastAsia="Calibri" w:hAnsi="Calibri"/>
-          <w:color w:val="111111"/>
-          <w:sz w:val="21"/>
-          <w:szCs w:val="21"/>
-        </w:rPr>
-        <w:t xml:space="preserve">2.2	Pay and leave: wages for the period from 26 June 2026; re-credit of all leave debited; the coding of the absence (special leave on full pay under Directive 12/24 was requested on 5 August); the “income protection” characterisation applied from 13 July 2026, under which I receive neither wages nor benefit (my response, section 5); and cessation of further debits per clause 1.11.4 — the status quo before this dispute emerged was that I was rostered, working and paid.</w:t>
-      </w:r>
-    </w:p>
-    <w:p>
-      <w:pPr>
-        <w:spacing w:after="160" w:line="276"/>
-        <w:ind w:left="360" w:hanging="360"/>
-      </w:pPr>
-      <w:r>
-        <w:rPr>
-          <w:rFonts w:ascii="Calibri" w:cs="Calibri" w:eastAsia="Calibri" w:hAnsi="Calibri"/>
-          <w:color w:val="111111"/>
-          <w:sz w:val="21"/>
-          <w:szCs w:val="21"/>
-        </w:rPr>
-        <w:t xml:space="preserve">2.3	Return to work: the Employee Capabilities Checklist of 3 July 2026 certifies me fit for work with restrictions and records the pattern as a “continuation of existing arrangement”; my return to work proposal of 3 August 2026 stands; no Return to Work Plan exists.</w:t>
-      </w:r>
-    </w:p>
-    <w:p>
-      <w:pPr>
-        <w:spacing w:after="160" w:line="276"/>
-        <w:ind w:left="360" w:hanging="360"/>
-      </w:pPr>
-      <w:r>
-        <w:rPr>
-          <w:rFonts w:ascii="Calibri" w:cs="Calibri" w:eastAsia="Calibri" w:hAnsi="Calibri"/>
-          <w:color w:val="111111"/>
-          <w:sz w:val="21"/>
-          <w:szCs w:val="21"/>
-        </w:rPr>
-        <w:t xml:space="preserve">2.4	The position communicated to my insurer: on 4 August 2026 my income protection insurer recorded, on information from the Health Service, that the Health Service is “currently unable to accommodate a graduated return to work”. I have not been given that position directly, by its maker, with reasons. My response, section 4, sets out what is asked; it remains open. </w:t>
-      </w:r>
-      <w:r>
-        <w:rPr>
-          <w:rFonts w:ascii="Calibri" w:cs="Calibri" w:eastAsia="Calibri" w:hAnsi="Calibri"/>
-          <w:color w:val="7A5C00"/>
-          <w:sz w:val="21"/>
-          <w:szCs w:val="21"/>
-          <w:highlight w:val="yellow"/>
-          <w:highlightCs w:val="yellow"/>
-        </w:rPr>
-        <w:t xml:space="preserve">[Adjust if the Stage 1 response addressed it.]</w:t>
-      </w:r>
-    </w:p>
-    <w:p>
-      <w:pPr>
-        <w:spacing w:after="160" w:line="276"/>
-        <w:ind w:left="360" w:hanging="360"/>
-      </w:pPr>
-      <w:r>
-        <w:rPr>
-          <w:rFonts w:ascii="Calibri" w:cs="Calibri" w:eastAsia="Calibri" w:hAnsi="Calibri"/>
-          <w:color w:val="111111"/>
-          <w:sz w:val="21"/>
-          <w:szCs w:val="21"/>
-        </w:rPr>
-        <w:t xml:space="preserve">2.5	The work health and safety matters: the feedback required by clause 7.1.11 on the matters I have raised, and the psychosocial risk assessment of the work area under clause 7.2, requested on 3 August 2026 and identified by the Health Service's own letter of 7 July 2026, which recorded that it did not then have sufficient information to assess psychosocial hazards affecting my return to work. No assessment has been undertaken.</w:t>
-      </w:r>
-    </w:p>
-    <w:p>
-      <w:pPr>
-        <w:spacing w:after="160" w:line="276"/>
-      </w:pPr>
-      <w:r>
-        <w:rPr>
-          <w:rFonts w:ascii="Calibri" w:cs="Calibri" w:eastAsia="Calibri" w:hAnsi="Calibri"/>
-          <w:b/>
-          <w:bCs/>
-          <w:color w:val="111111"/>
-          <w:sz w:val="21"/>
-          <w:szCs w:val="21"/>
-        </w:rPr>
-        <w:t xml:space="preserve">3  Arrangements</w:t>
+        <w:t xml:space="preserve">4  Arrangements</w:t>
       </w:r>
     </w:p>
     <w:p>

</xml_diff>

<commit_message>
Stage 2 docx: 4 Aug letter is the only MSH response; single open area is the union section
1.5 rewritten to record no reply to the 5 August response; fourth attachment
removed. One highlighted section remains, reserved for Together Queensland.

Co-Authored-By: Claude Fable 5 <noreply@anthropic.com>
Claude-Session: https://claude.ai/code/session_01P17mt65P6No5vkc3DV9xfU
</commit_message>
<xml_diff>
--- a/wc2024227/drafts/out/STAGE2_REFERRAL_DRAFT_FOR_REVIEW.docx
+++ b/wc2024227/drafts/out/STAGE2_REFERRAL_DRAFT_FOR_REVIEW.docx
@@ -104,7 +104,7 @@
           <w:sz w:val="21"/>
           <w:szCs w:val="21"/>
         </w:rPr>
-        <w:t xml:space="preserve">(1) Notice of dispute, 3 August 2026; (2) Ms Taylor's letter, 4 August 2026; (3) my response dated 4 August 2026 (provided 5 August 2026); (4) the Health Service's further Stage 1 response.</w:t>
+        <w:t xml:space="preserve">(1) Notice of dispute, 3 August 2026; (2) Ms Taylor's letter, 4 August 2026; (3) my response dated 4 August 2026 (provided 5 August 2026).</w:t>
       </w:r>
     </w:p>
     <w:p>
@@ -256,7 +256,7 @@
           <w:sz w:val="21"/>
           <w:szCs w:val="21"/>
         </w:rPr>
-        <w:t xml:space="preserve">1.5	The Health Service has since provided one further written response, which is the only response received to my correspondence of 5 August 2026. It does not resolve the matters in dispute: it does not identify the instrument under which I am held from work (question 3.1), it does not restore the status quo under clause 1.11.4, and the leave and pay position from 26 June 2026 remains as it was.</w:t>
+        <w:t xml:space="preserve">1.5	The letter of 4 August 2026 is the only communication received from the Health Service during the Stage 1 period. My response of 5 August 2026 has not been answered. The matters in dispute accordingly remain unresolved: the instrument under which I am held from work has not been identified (question 3.1), the status quo under clause 1.11.4 has not been restored, and the leave and pay position from 26 June 2026 remains as it was.</w:t>
       </w:r>
     </w:p>
     <w:p>

</xml_diff>

<commit_message>
Stage 2 docx: union section covers conference support + delegate confirmation
Co-Authored-By: Claude Fable 5 <noreply@anthropic.com>
Claude-Session: https://claude.ai/code/session_01P17mt65P6No5vkc3DV9xfU
</commit_message>
<xml_diff>
--- a/wc2024227/drafts/out/STAGE2_REFERRAL_DRAFT_FOR_REVIEW.docx
+++ b/wc2024227/drafts/out/STAGE2_REFERRAL_DRAFT_FOR_REVIEW.docx
@@ -392,7 +392,7 @@
           <w:sz w:val="21"/>
           <w:szCs w:val="21"/>
         </w:rPr>
-        <w:t xml:space="preserve">3  Union representation and delegate status</w:t>
+        <w:t xml:space="preserve">3  Union representation</w:t>
       </w:r>
     </w:p>
     <w:p>
@@ -408,7 +408,7 @@
           <w:highlight w:val="yellow"/>
           <w:highlightCs w:val="yellow"/>
         </w:rPr>
-        <w:t xml:space="preserve">[Section reserved for Together Queensland — to be completed on the union's confirmation before sending.]</w:t>
+        <w:t xml:space="preserve">[To be completed on Together Queensland's advice: whether Together will represent me, or attend with me, at the Stage 2 conference; and the union's confirmation of my delegate status for the workplace, with the request that this Stage 2 process be conducted consistently with clause 3.1.5. If the union's advice has not arrived before sending, delete this section and renumber section 4 to 3 — the referral stands on its own.]</w:t>
       </w:r>
     </w:p>
     <w:p>

</xml_diff>

<commit_message>
Stage 2 docx: relative dates, 2.6 residual-items line, 10.3.2 carve-out
Co-Authored-By: Claude Fable 5 <noreply@anthropic.com>
Claude-Session: https://claude.ai/code/session_01P17mt65P6No5vkc3DV9xfU
</commit_message>
<xml_diff>
--- a/wc2024227/drafts/out/STAGE2_REFERRAL_DRAFT_FOR_REVIEW.docx
+++ b/wc2024227/drafts/out/STAGE2_REFERRAL_DRAFT_FOR_REVIEW.docx
@@ -29,7 +29,7 @@
           <w:sz w:val="18"/>
           <w:szCs w:val="18"/>
         </w:rPr>
-        <w:t xml:space="preserve">Stage 2 referral · one section remains open, reserved for Together Queensland's input; all else is final. Send Monday 10 August 2026.</w:t>
+        <w:t xml:space="preserve">Stage 2 referral · one section remains open, reserved for Together Queensland's input; all else is final. Send as soon as the union section resolves — the Stage 2 seven days run from the date of sending.</w:t>
       </w:r>
     </w:p>
     <w:p>
@@ -285,7 +285,7 @@
           <w:sz w:val="21"/>
           <w:szCs w:val="21"/>
         </w:rPr>
-        <w:t xml:space="preserve">My response foreshadowed this referral in terms: “If the dispute is unresolved by 10 August I will refer it to Stage 2 as the clause provides.” It is unresolved, and this is that referral.</w:t>
+        <w:t xml:space="preserve">My response foreshadowed this referral in terms: “If the dispute is unresolved by 10 August I will refer it to Stage 2 as the clause provides.” That date has passed, the dispute remains unresolved, and this is that referral.</w:t>
       </w:r>
     </w:p>
     <w:p>
@@ -382,6 +382,35 @@
     <w:p>
       <w:pPr>
         <w:spacing w:after="160" w:line="276"/>
+        <w:ind w:left="360" w:hanging="360"/>
+      </w:pPr>
+      <w:r>
+        <w:rPr>
+          <w:rFonts w:ascii="Calibri" w:cs="Calibri" w:eastAsia="Calibri" w:hAnsi="Calibri"/>
+          <w:color w:val="111111"/>
+          <w:sz w:val="21"/>
+          <w:szCs w:val="21"/>
+        </w:rPr>
+        <w:t xml:space="preserve">2.6	Any remaining unanswered items of the Stage 1 notice of 3 August 2026 and my response dated 4 August 2026 (including the policies sought, the roster and payroll records, and the suspension or status question), to the extent not already covered by 2.1 to 2.5.</w:t>
+      </w:r>
+    </w:p>
+    <w:p>
+      <w:pPr>
+        <w:spacing w:after="160" w:line="276"/>
+      </w:pPr>
+      <w:r>
+        <w:rPr>
+          <w:rFonts w:ascii="Calibri" w:cs="Calibri" w:eastAsia="Calibri" w:hAnsi="Calibri"/>
+          <w:color w:val="111111"/>
+          <w:sz w:val="21"/>
+          <w:szCs w:val="21"/>
+        </w:rPr>
+        <w:t xml:space="preserve">For clarity, my separate request of 3 August 2026 under clause 10.3.2 is not part of this dispute and continues on its own timeframe.</w:t>
+      </w:r>
+    </w:p>
+    <w:p>
+      <w:pPr>
+        <w:spacing w:after="160" w:line="276"/>
       </w:pPr>
       <w:r>
         <w:rPr>
@@ -438,7 +467,7 @@
           <w:sz w:val="21"/>
           <w:szCs w:val="21"/>
         </w:rPr>
-        <w:t xml:space="preserve">Clause 1.11.2(b) provides that the management representative shall arrange a conference of the parties, and that the process should not extend beyond seven days — that is, by Monday 17 August 2026. I am available at any time, with my support person and union representative present. I ask that whoever attends for the Health Service have authority to resolve the matters at 2.1 to 2.5, and that the answers to the seven questions of my response be available at the conference. I will provide anything further required the same day it is requested.</w:t>
+        <w:t xml:space="preserve">Clause 1.11.2(b) provides that the management representative shall arrange a conference of the parties, and that the process should not extend beyond seven days from this referral. I am available at any time, with my support person and union representative present. I ask that whoever attends for the Health Service have authority to resolve the matters at 2.1 to 2.6, and that the answers to the seven questions of my response be available at the conference. I will provide anything further required the same day it is requested.</w:t>
       </w:r>
     </w:p>
     <w:p>

</xml_diff>